<commit_message>
Add phase 2 Excel-driven data source
Reads invoice data from Invoice_Data.xlsx (label/value columns, extracted
signature image) instead of hardcoded values. GST/CGST/SGST and all totals
are computed from quantity and price per unit rather than read from the
sheet. Restores the "Tax Summary:" label above the tax breakdown table.
</commit_message>
<xml_diff>
--- a/Tax_Invoice.docx
+++ b/Tax_Invoice.docx
@@ -219,7 +219,7 @@
                 <w:rFonts w:ascii="Arial" w:hAnsi="Arial" w:eastAsia="Arial" w:cs="Arial"/>
                 <w:sz w:val="16"/>
               </w:rPr>
-              <w:t>INV-214</w:t>
+              <w:t>INV-215</w:t>
             </w:r>
           </w:p>
           <w:p>
@@ -255,7 +255,7 @@
                 <w:rFonts w:ascii="Arial" w:hAnsi="Arial" w:eastAsia="Arial" w:cs="Arial"/>
                 <w:sz w:val="16"/>
               </w:rPr>
-              <w:t>24-Jun-2026</w:t>
+              <w:t>24-Jun-2027</w:t>
             </w:r>
           </w:p>
           <w:p>
@@ -291,7 +291,7 @@
                 <w:rFonts w:ascii="Arial" w:hAnsi="Arial" w:eastAsia="Arial" w:cs="Arial"/>
                 <w:sz w:val="16"/>
               </w:rPr>
-              <w:t>26-Jun-2026</w:t>
+              <w:t>26-Jun-2027</w:t>
             </w:r>
           </w:p>
           <w:p>
@@ -327,7 +327,7 @@
                 <w:rFonts w:ascii="Arial" w:hAnsi="Arial" w:eastAsia="Arial" w:cs="Arial"/>
                 <w:sz w:val="16"/>
               </w:rPr>
-              <w:t>36-Telangana</w:t>
+              <w:t>37-Karnataka</w:t>
             </w:r>
           </w:p>
         </w:tc>
@@ -388,7 +388,7 @@
                 <w:b/>
                 <w:sz w:val="16"/>
               </w:rPr>
-              <w:t>HEARTCULTURE NATURAL PRODUCT LLP</w:t>
+              <w:t>HEARTCULTURE NATURAL PRODUCT LLP2</w:t>
             </w:r>
           </w:p>
           <w:p>
@@ -398,7 +398,7 @@
                 <w:b w:val="0"/>
                 <w:sz w:val="16"/>
               </w:rPr>
-              <w:t>13-110 Kanha village nandigama mandal</w:t>
+              <w:t>13-110 Kanha village nandigama mandal2</w:t>
             </w:r>
           </w:p>
           <w:p>
@@ -408,7 +408,7 @@
                 <w:b w:val="0"/>
                 <w:sz w:val="16"/>
               </w:rPr>
-              <w:t>Ranga Reddy telangana 509325</w:t>
+              <w:t>Ranga Reddy telangana 5093252</w:t>
             </w:r>
           </w:p>
           <w:p>
@@ -442,7 +442,7 @@
                 <w:rFonts w:ascii="Arial" w:hAnsi="Arial" w:eastAsia="Arial" w:cs="Arial"/>
                 <w:sz w:val="16"/>
               </w:rPr>
-              <w:t>: 36-Telangana</w:t>
+              <w:t>: 36-Telangana2</w:t>
             </w:r>
           </w:p>
           <w:p>
@@ -467,7 +467,7 @@
                 <w:rFonts w:ascii="Arial" w:hAnsi="Arial" w:eastAsia="Arial" w:cs="Arial"/>
                 <w:sz w:val="16"/>
               </w:rPr>
-              <w:t>: 36AAMFH4243C1ZL</w:t>
+              <w:t>: 36AAMFH4243C1ZL2</w:t>
             </w:r>
           </w:p>
         </w:tc>
@@ -502,7 +502,7 @@
                 <w:b w:val="0"/>
                 <w:sz w:val="16"/>
               </w:rPr>
-              <w:t>Rajasthan</w:t>
+              <w:t>Rajasthan2</w:t>
             </w:r>
           </w:p>
         </w:tc>
@@ -635,7 +635,7 @@
                 <w:rFonts w:ascii="Arial" w:hAnsi="Arial" w:eastAsia="Arial" w:cs="Arial"/>
                 <w:sz w:val="16"/>
               </w:rPr>
-              <w:t>RJ 19 GF 8254</w:t>
+              <w:t>RJ 19 GF 8252</w:t>
             </w:r>
           </w:p>
           <w:p>
@@ -671,7 +671,7 @@
                 <w:rFonts w:ascii="Arial" w:hAnsi="Arial" w:eastAsia="Arial" w:cs="Arial"/>
                 <w:sz w:val="16"/>
               </w:rPr>
-              <w:t>Rajasthan</w:t>
+              <w:t>Rajasthan2</w:t>
             </w:r>
           </w:p>
         </w:tc>
@@ -990,7 +990,7 @@
                 <w:b w:val="0"/>
                 <w:sz w:val="16"/>
               </w:rPr>
-              <w:t>10</w:t>
+              <w:t>102</w:t>
             </w:r>
           </w:p>
         </w:tc>
@@ -1046,7 +1046,7 @@
                 <w:b w:val="0"/>
                 <w:sz w:val="16"/>
               </w:rPr>
-              <w:t>4,900.00</w:t>
+              <w:t>100.00</w:t>
             </w:r>
           </w:p>
         </w:tc>
@@ -1074,9 +1074,9 @@
                 <w:b w:val="0"/>
                 <w:sz w:val="16"/>
               </w:rPr>
-              <w:t>2,450.00</w:t>
+              <w:t>510.00</w:t>
               <w:br/>
-              <w:t>(5.0%)</w:t>
+              <w:t>(5%)</w:t>
             </w:r>
           </w:p>
         </w:tc>
@@ -1104,7 +1104,7 @@
                 <w:b w:val="0"/>
                 <w:sz w:val="16"/>
               </w:rPr>
-              <w:t>51,450.00</w:t>
+              <w:t>10,710.00</w:t>
             </w:r>
           </w:p>
         </w:tc>
@@ -1190,7 +1190,7 @@
                 <w:b/>
                 <w:sz w:val="16"/>
               </w:rPr>
-              <w:t>2,450.00</w:t>
+              <w:t>510.00</w:t>
             </w:r>
           </w:p>
         </w:tc>
@@ -1218,7 +1218,7 @@
                 <w:b/>
                 <w:sz w:val="16"/>
               </w:rPr>
-              <w:t>51,450.00</w:t>
+              <w:t>10,710.00</w:t>
             </w:r>
           </w:p>
         </w:tc>
@@ -1233,6 +1233,16 @@
           <w:rFonts w:ascii="Arial" w:hAnsi="Arial" w:eastAsia="Arial" w:cs="Arial"/>
           <w:sz w:val="4"/>
         </w:rPr>
+      </w:r>
+    </w:p>
+    <w:p>
+      <w:r>
+        <w:rPr>
+          <w:rFonts w:ascii="Arial" w:hAnsi="Arial" w:eastAsia="Arial" w:cs="Arial"/>
+          <w:b/>
+          <w:sz w:val="16"/>
+        </w:rPr>
+        <w:t>Tax Summary:</w:t>
       </w:r>
     </w:p>
     <w:tbl>
@@ -1521,7 +1531,7 @@
                 <w:b w:val="0"/>
                 <w:sz w:val="14"/>
               </w:rPr>
-              <w:t>49,000.00</w:t>
+              <w:t>10,200.00</w:t>
             </w:r>
           </w:p>
         </w:tc>
@@ -1577,7 +1587,7 @@
                 <w:b w:val="0"/>
                 <w:sz w:val="14"/>
               </w:rPr>
-              <w:t>1,225.00</w:t>
+              <w:t>255.00</w:t>
             </w:r>
           </w:p>
         </w:tc>
@@ -1633,7 +1643,7 @@
                 <w:b w:val="0"/>
                 <w:sz w:val="14"/>
               </w:rPr>
-              <w:t>1,225.00</w:t>
+              <w:t>255.00</w:t>
             </w:r>
           </w:p>
         </w:tc>
@@ -1661,7 +1671,7 @@
                 <w:b w:val="0"/>
                 <w:sz w:val="14"/>
               </w:rPr>
-              <w:t>2,450.00</w:t>
+              <w:t>510.00</w:t>
             </w:r>
           </w:p>
         </w:tc>
@@ -1746,7 +1756,7 @@
                 <w:b/>
                 <w:sz w:val="14"/>
               </w:rPr>
-              <w:t>1,225.00</w:t>
+              <w:t>255.00</w:t>
             </w:r>
           </w:p>
         </w:tc>
@@ -1801,7 +1811,7 @@
                 <w:b/>
                 <w:sz w:val="14"/>
               </w:rPr>
-              <w:t>1,225.00</w:t>
+              <w:t>255.00</w:t>
             </w:r>
           </w:p>
         </w:tc>
@@ -1829,7 +1839,7 @@
                 <w:b/>
                 <w:sz w:val="14"/>
               </w:rPr>
-              <w:t>2,450.00</w:t>
+              <w:t>510.00</w:t>
             </w:r>
           </w:p>
         </w:tc>
@@ -1951,7 +1961,7 @@
                 <w:b/>
                 <w:sz w:val="16"/>
               </w:rPr>
-              <w:t>Balance :  Rs. 51,450.00</w:t>
+              <w:t>Balance :  Rs. 10,710.00</w:t>
             </w:r>
           </w:p>
         </w:tc>
@@ -2132,14 +2142,42 @@
           </w:p>
           <w:p>
             <w:pPr>
+              <w:spacing w:before="80" w:after="0"/>
               <w:jc w:val="center"/>
             </w:pPr>
             <w:r>
-              <w:rPr>
-                <w:rFonts w:ascii="Arial" w:hAnsi="Arial" w:eastAsia="Arial" w:cs="Arial"/>
-                <w:b w:val="0"/>
-                <w:sz w:val="4"/>
-              </w:rPr>
+              <w:drawing>
+                <wp:inline xmlns:a="http://schemas.openxmlformats.org/drawingml/2006/main" xmlns:pic="http://schemas.openxmlformats.org/drawingml/2006/picture">
+                  <wp:extent cx="1528302" cy="360000"/>
+                  <wp:docPr id="1" name="Picture 1"/>
+                  <wp:cNvGraphicFramePr>
+                    <a:graphicFrameLocks noChangeAspect="1"/>
+                  </wp:cNvGraphicFramePr>
+                  <a:graphic>
+                    <a:graphicData uri="http://schemas.openxmlformats.org/drawingml/2006/picture">
+                      <pic:pic>
+                        <pic:nvPicPr>
+                          <pic:cNvPr id="0" name="_signature_extracted.png"/>
+                          <pic:cNvPicPr/>
+                        </pic:nvPicPr>
+                        <pic:blipFill>
+                          <a:blip r:embed="rId9"/>
+                          <a:stretch>
+                            <a:fillRect/>
+                          </a:stretch>
+                        </pic:blipFill>
+                        <pic:spPr>
+                          <a:xfrm>
+                            <a:off x="0" y="0"/>
+                            <a:ext cx="1528302" cy="360000"/>
+                          </a:xfrm>
+                          <a:prstGeom prst="rect"/>
+                        </pic:spPr>
+                      </pic:pic>
+                    </a:graphicData>
+                  </a:graphic>
+                </wp:inline>
+              </w:drawing>
             </w:r>
           </w:p>
           <w:p>
@@ -2149,32 +2187,6 @@
             <w:r>
               <w:rPr>
                 <w:rFonts w:ascii="Arial" w:hAnsi="Arial" w:eastAsia="Arial" w:cs="Arial"/>
-                <w:b w:val="0"/>
-                <w:sz w:val="4"/>
-              </w:rPr>
-            </w:r>
-          </w:p>
-          <w:p>
-            <w:pPr>
-              <w:jc w:val="center"/>
-            </w:pPr>
-            <w:r>
-              <w:rPr>
-                <w:rFonts w:ascii="Arial" w:hAnsi="Arial" w:eastAsia="Arial" w:cs="Arial"/>
-                <w:b w:val="0"/>
-                <w:sz w:val="20"/>
-              </w:rPr>
-              <w:t>Bharathil</w:t>
-            </w:r>
-          </w:p>
-          <w:p>
-            <w:pPr>
-              <w:jc w:val="center"/>
-            </w:pPr>
-            <w:r>
-              <w:rPr>
-                <w:rFonts w:ascii="Arial" w:hAnsi="Arial" w:eastAsia="Arial" w:cs="Arial"/>
-                <w:b w:val="0"/>
                 <w:sz w:val="16"/>
               </w:rPr>
               <w:t>Authorized Signatory</w:t>

</xml_diff>

<commit_message>
Make signature loading robust and fix silent failure on handoff
Signature now primarily comes from a filename typed in the sheet's
Signature cell (checked next to the workbook), avoiding the fragility of
extracting an image embedded in Excel across different Excel versions or
copy methods. Embedded-image extraction remains as a fallback, now picking
the image anchored nearest the Signature row instead of always the first
one in the sheet. Either path now prints a clear warning instead of
silently producing an invoice with no signature.
</commit_message>
<xml_diff>
--- a/Tax_Invoice.docx
+++ b/Tax_Invoice.docx
@@ -219,7 +219,7 @@
                 <w:rFonts w:ascii="Arial" w:hAnsi="Arial" w:eastAsia="Arial" w:cs="Arial"/>
                 <w:sz w:val="16"/>
               </w:rPr>
-              <w:t>INV-215</w:t>
+              <w:t>INV-214</w:t>
             </w:r>
           </w:p>
           <w:p>
@@ -255,7 +255,7 @@
                 <w:rFonts w:ascii="Arial" w:hAnsi="Arial" w:eastAsia="Arial" w:cs="Arial"/>
                 <w:sz w:val="16"/>
               </w:rPr>
-              <w:t>24-Jun-2027</w:t>
+              <w:t>24-Jun-2026</w:t>
             </w:r>
           </w:p>
           <w:p>
@@ -291,7 +291,7 @@
                 <w:rFonts w:ascii="Arial" w:hAnsi="Arial" w:eastAsia="Arial" w:cs="Arial"/>
                 <w:sz w:val="16"/>
               </w:rPr>
-              <w:t>26-Jun-2027</w:t>
+              <w:t>26-Jun-2026</w:t>
             </w:r>
           </w:p>
           <w:p>
@@ -327,7 +327,7 @@
                 <w:rFonts w:ascii="Arial" w:hAnsi="Arial" w:eastAsia="Arial" w:cs="Arial"/>
                 <w:sz w:val="16"/>
               </w:rPr>
-              <w:t>37-Karnataka</w:t>
+              <w:t>36-Telangana</w:t>
             </w:r>
           </w:p>
         </w:tc>
@@ -388,7 +388,7 @@
                 <w:b/>
                 <w:sz w:val="16"/>
               </w:rPr>
-              <w:t>HEARTCULTURE NATURAL PRODUCT LLP2</w:t>
+              <w:t>HEARTCULTURE NATURAL PRODUCT LLP</w:t>
             </w:r>
           </w:p>
           <w:p>
@@ -398,7 +398,7 @@
                 <w:b w:val="0"/>
                 <w:sz w:val="16"/>
               </w:rPr>
-              <w:t>13-110 Kanha village nandigama mandal2</w:t>
+              <w:t>13-110 Kanha village nandigama mandal</w:t>
             </w:r>
           </w:p>
           <w:p>
@@ -408,7 +408,7 @@
                 <w:b w:val="0"/>
                 <w:sz w:val="16"/>
               </w:rPr>
-              <w:t>Ranga Reddy telangana 5093252</w:t>
+              <w:t>Ranga Reddy telangana 509325</w:t>
             </w:r>
           </w:p>
           <w:p>
@@ -442,7 +442,7 @@
                 <w:rFonts w:ascii="Arial" w:hAnsi="Arial" w:eastAsia="Arial" w:cs="Arial"/>
                 <w:sz w:val="16"/>
               </w:rPr>
-              <w:t>: 36-Telangana2</w:t>
+              <w:t>: 36-Telangana</w:t>
             </w:r>
           </w:p>
           <w:p>
@@ -467,7 +467,7 @@
                 <w:rFonts w:ascii="Arial" w:hAnsi="Arial" w:eastAsia="Arial" w:cs="Arial"/>
                 <w:sz w:val="16"/>
               </w:rPr>
-              <w:t>: 36AAMFH4243C1ZL2</w:t>
+              <w:t>: 36AAMFH4243C1ZL</w:t>
             </w:r>
           </w:p>
         </w:tc>
@@ -502,7 +502,7 @@
                 <w:b w:val="0"/>
                 <w:sz w:val="16"/>
               </w:rPr>
-              <w:t>Rajasthan2</w:t>
+              <w:t>Rajasthan</w:t>
             </w:r>
           </w:p>
         </w:tc>
@@ -635,7 +635,7 @@
                 <w:rFonts w:ascii="Arial" w:hAnsi="Arial" w:eastAsia="Arial" w:cs="Arial"/>
                 <w:sz w:val="16"/>
               </w:rPr>
-              <w:t>RJ 19 GF 8252</w:t>
+              <w:t>RJ 19 GF 8254</w:t>
             </w:r>
           </w:p>
           <w:p>
@@ -671,7 +671,7 @@
                 <w:rFonts w:ascii="Arial" w:hAnsi="Arial" w:eastAsia="Arial" w:cs="Arial"/>
                 <w:sz w:val="16"/>
               </w:rPr>
-              <w:t>Rajasthan2</w:t>
+              <w:t>Rajasthan</w:t>
             </w:r>
           </w:p>
         </w:tc>
@@ -990,7 +990,7 @@
                 <w:b w:val="0"/>
                 <w:sz w:val="16"/>
               </w:rPr>
-              <w:t>102</w:t>
+              <w:t>10</w:t>
             </w:r>
           </w:p>
         </w:tc>
@@ -1046,7 +1046,7 @@
                 <w:b w:val="0"/>
                 <w:sz w:val="16"/>
               </w:rPr>
-              <w:t>100.00</w:t>
+              <w:t>4,900.00</w:t>
             </w:r>
           </w:p>
         </w:tc>
@@ -1074,7 +1074,7 @@
                 <w:b w:val="0"/>
                 <w:sz w:val="16"/>
               </w:rPr>
-              <w:t>510.00</w:t>
+              <w:t>2,450.00</w:t>
               <w:br/>
               <w:t>(5%)</w:t>
             </w:r>
@@ -1104,7 +1104,7 @@
                 <w:b w:val="0"/>
                 <w:sz w:val="16"/>
               </w:rPr>
-              <w:t>10,710.00</w:t>
+              <w:t>51,450.00</w:t>
             </w:r>
           </w:p>
         </w:tc>
@@ -1190,7 +1190,7 @@
                 <w:b/>
                 <w:sz w:val="16"/>
               </w:rPr>
-              <w:t>510.00</w:t>
+              <w:t>2,450.00</w:t>
             </w:r>
           </w:p>
         </w:tc>
@@ -1218,7 +1218,7 @@
                 <w:b/>
                 <w:sz w:val="16"/>
               </w:rPr>
-              <w:t>10,710.00</w:t>
+              <w:t>51,450.00</w:t>
             </w:r>
           </w:p>
         </w:tc>
@@ -1251,6 +1251,14 @@
         <w:jc w:val="center"/>
         <w:tblLayout w:type="fixed"/>
         <w:tblLook w:firstColumn="1" w:firstRow="1" w:lastColumn="0" w:lastRow="0" w:noHBand="0" w:noVBand="1" w:val="04A0"/>
+        <w:tblBorders>
+          <w:top w:val="single" w:sz="4" w:color="000000"/>
+          <w:left w:val="single" w:sz="4" w:color="000000"/>
+          <w:bottom w:val="single" w:sz="4" w:color="000000"/>
+          <w:right w:val="single" w:sz="4" w:color="000000"/>
+          <w:insideH w:val="single" w:sz="4" w:color="000000"/>
+          <w:insideV w:val="single" w:sz="4" w:color="000000"/>
+        </w:tblBorders>
       </w:tblPr>
       <w:tblGrid>
         <w:gridCol w:w="2350"/>
@@ -1531,7 +1539,7 @@
                 <w:b w:val="0"/>
                 <w:sz w:val="14"/>
               </w:rPr>
-              <w:t>10,200.00</w:t>
+              <w:t>49,000.00</w:t>
             </w:r>
           </w:p>
         </w:tc>
@@ -1587,7 +1595,7 @@
                 <w:b w:val="0"/>
                 <w:sz w:val="14"/>
               </w:rPr>
-              <w:t>255.00</w:t>
+              <w:t>1,225.00</w:t>
             </w:r>
           </w:p>
         </w:tc>
@@ -1643,7 +1651,7 @@
                 <w:b w:val="0"/>
                 <w:sz w:val="14"/>
               </w:rPr>
-              <w:t>255.00</w:t>
+              <w:t>1,225.00</w:t>
             </w:r>
           </w:p>
         </w:tc>
@@ -1671,7 +1679,7 @@
                 <w:b w:val="0"/>
                 <w:sz w:val="14"/>
               </w:rPr>
-              <w:t>510.00</w:t>
+              <w:t>2,450.00</w:t>
             </w:r>
           </w:p>
         </w:tc>
@@ -1756,7 +1764,7 @@
                 <w:b/>
                 <w:sz w:val="14"/>
               </w:rPr>
-              <w:t>255.00</w:t>
+              <w:t>1,225.00</w:t>
             </w:r>
           </w:p>
         </w:tc>
@@ -1811,7 +1819,7 @@
                 <w:b/>
                 <w:sz w:val="14"/>
               </w:rPr>
-              <w:t>255.00</w:t>
+              <w:t>1,225.00</w:t>
             </w:r>
           </w:p>
         </w:tc>
@@ -1839,7 +1847,7 @@
                 <w:b/>
                 <w:sz w:val="14"/>
               </w:rPr>
-              <w:t>510.00</w:t>
+              <w:t>2,450.00</w:t>
             </w:r>
           </w:p>
         </w:tc>
@@ -1961,7 +1969,7 @@
                 <w:b/>
                 <w:sz w:val="16"/>
               </w:rPr>
-              <w:t>Balance :  Rs. 10,710.00</w:t>
+              <w:t>Balance :  Rs. 51,450.00</w:t>
             </w:r>
           </w:p>
         </w:tc>
@@ -2157,7 +2165,7 @@
                     <a:graphicData uri="http://schemas.openxmlformats.org/drawingml/2006/picture">
                       <pic:pic>
                         <pic:nvPicPr>
-                          <pic:cNvPr id="0" name="_signature_extracted.png"/>
+                          <pic:cNvPr id="0" name="signature_sample.png"/>
                           <pic:cNvPicPr/>
                         </pic:nvPicPr>
                         <pic:blipFill>

</xml_diff>